<commit_message>
mirror the refinements into the markdown and docx
</commit_message>
<xml_diff>
--- a/manuscript/paper.docx
+++ b/manuscript/paper.docx
@@ -2,7 +2,7 @@
 <file path=word/document.xml><?xml version="1.0" encoding="utf-8"?>
 <w:document xmlns:w="http://schemas.openxmlformats.org/wordprocessingml/2006/main" xmlns:m="http://schemas.openxmlformats.org/officeDocument/2006/math" xmlns:r="http://schemas.openxmlformats.org/officeDocument/2006/relationships" xmlns:o="urn:schemas-microsoft-com:office:office" xmlns:v="urn:schemas-microsoft-com:vml" xmlns:w10="urn:schemas-microsoft-com:office:word" xmlns:a="http://schemas.openxmlformats.org/drawingml/2006/main" xmlns:pic="http://schemas.openxmlformats.org/drawingml/2006/picture" xmlns:wp="http://schemas.openxmlformats.org/drawingml/2006/wordprocessingDrawing">
   <w:body>
-    <w:bookmarkStart w:id="36" w:name="Xd77848edbe84a3c64ad19075b5bd637e09a0ae5"/>
+    <w:bookmarkStart w:id="39" w:name="Xd77848edbe84a3c64ad19075b5bd637e09a0ae5"/>
     <w:p>
       <w:pPr>
         <w:pStyle w:val="Heading1"/>
@@ -113,7 +113,13 @@
         <w:t xml:space="preserve"> </w:t>
       </w:r>
       <w:r>
-        <w:t xml:space="preserve">above chance. The same features predict diabetes under subject-grouped</w:t>
+        <w:t xml:space="preserve">above chance (the correct person is among the top five guesses 39% of the time,</w:t>
+      </w:r>
+      <w:r>
+        <w:t xml:space="preserve"> </w:t>
+      </w:r>
+      <w:r>
+        <w:t xml:space="preserve">against 11% by chance). The same features predict diabetes under subject-grouped</w:t>
       </w:r>
       <w:r>
         <w:t xml:space="preserve"> </w:t>
@@ -241,7 +247,25 @@
         <w:t xml:space="preserve"> </w:t>
       </w:r>
       <w:r>
-        <w:t xml:space="preserve">individuality as an accuracy rather than an impression.</w:t>
+        <w:t xml:space="preserve">individuality as an accuracy rather than an impression. Cast this way it is a</w:t>
+      </w:r>
+      <w:r>
+        <w:t xml:space="preserve"> </w:t>
+      </w:r>
+      <w:r>
+        <w:t xml:space="preserve">data-mining question: finding a stable individual signature in noisy, repeated</w:t>
+      </w:r>
+      <w:r>
+        <w:t xml:space="preserve"> </w:t>
+      </w:r>
+      <w:r>
+        <w:t xml:space="preserve">physiological measurements, and mining that signature for a downstream clinical</w:t>
+      </w:r>
+      <w:r>
+        <w:t xml:space="preserve"> </w:t>
+      </w:r>
+      <w:r>
+        <w:t xml:space="preserve">signal.</w:t>
       </w:r>
     </w:p>
     <w:p>
@@ -651,7 +675,7 @@
       </w:r>
     </w:p>
     <w:bookmarkEnd w:id="11"/>
-    <w:bookmarkStart w:id="18" w:name="methods"/>
+    <w:bookmarkStart w:id="21" w:name="methods"/>
     <w:p>
       <w:pPr>
         <w:pStyle w:val="Heading2"/>
@@ -660,7 +684,7 @@
         <w:t xml:space="preserve">Methods</w:t>
       </w:r>
     </w:p>
-    <w:bookmarkStart w:id="12" w:name="data-and-feature-extraction"/>
+    <w:bookmarkStart w:id="15" w:name="data-and-feature-extraction"/>
     <w:p>
       <w:pPr>
         <w:pStyle w:val="Heading3"/>
@@ -698,7 +722,7 @@
         <w:t xml:space="preserve"> </w:t>
       </w:r>
       <w:r>
-        <w:t xml:space="preserve">the meal, so every excursion is described on the same time axis.</w:t>
+        <w:t xml:space="preserve">the meal, so every excursion is described on the same time axis (Figure 1).</w:t>
       </w:r>
       <w:r>
         <w:t xml:space="preserve"> </w:t>
@@ -711,584 +735,6 @@
       </w:r>
       <w:r>
         <w:t xml:space="preserve">excursions from 45 subjects.</w:t>
-      </w:r>
-    </w:p>
-    <w:p>
-      <w:pPr>
-        <w:pStyle w:val="BodyText"/>
-      </w:pPr>
-      <w:r>
-        <w:t xml:space="preserve">From each window we compute ten features that summarize the curve rather than a</w:t>
-      </w:r>
-      <w:r>
-        <w:t xml:space="preserve"> </w:t>
-      </w:r>
-      <w:r>
-        <w:t xml:space="preserve">single average. Four are amplitude features (pre-meal baseline, peak, the rise</w:t>
-      </w:r>
-      <w:r>
-        <w:t xml:space="preserve"> </w:t>
-      </w:r>
-      <w:r>
-        <w:t xml:space="preserve">from baseline to peak, and the area above baseline), two are timing features</w:t>
-      </w:r>
-      <w:r>
-        <w:t xml:space="preserve"> </w:t>
-      </w:r>
-      <w:r>
-        <w:t xml:space="preserve">(time to peak and time back to baseline), two are kinetic (the average up-slope</w:t>
-      </w:r>
-      <w:r>
-        <w:t xml:space="preserve"> </w:t>
-      </w:r>
-      <w:r>
-        <w:t xml:space="preserve">and down-slope), and two describe the distribution of glucose in the window</w:t>
-      </w:r>
-      <w:r>
-        <w:t xml:space="preserve"> </w:t>
-      </w:r>
-      <w:r>
-        <w:t xml:space="preserve">(skewness and kurtosis). The result is one row per meal, which the later analyses</w:t>
-      </w:r>
-      <w:r>
-        <w:t xml:space="preserve"> </w:t>
-      </w:r>
-      <w:r>
-        <w:t xml:space="preserve">treat as a repeated measurement of the person who ate it.</w:t>
-      </w:r>
-    </w:p>
-    <w:bookmarkEnd w:id="12"/>
-    <w:bookmarkStart w:id="13" w:name="covariate-adjusted-individuality"/>
-    <w:p>
-      <w:pPr>
-        <w:pStyle w:val="Heading3"/>
-      </w:pPr>
-      <w:r>
-        <w:t xml:space="preserve">Covariate-adjusted individuality</w:t>
-      </w:r>
-    </w:p>
-    <w:p>
-      <w:pPr>
-        <w:pStyle w:val="FirstParagraph"/>
-      </w:pPr>
-      <w:r>
-        <w:t xml:space="preserve">For each feature we first ask how much of its variance is between people rather</w:t>
-      </w:r>
-      <w:r>
-        <w:t xml:space="preserve"> </w:t>
-      </w:r>
-      <w:r>
-        <w:t xml:space="preserve">than within a person across meals. We use the intraclass correlation coefficient</w:t>
-      </w:r>
-      <w:r>
-        <w:t xml:space="preserve"> </w:t>
-      </w:r>
-      <w:r>
-        <w:t xml:space="preserve">in its one-way form, computed from the between- and within-subject mean squares</w:t>
-      </w:r>
-      <w:r>
-        <w:t xml:space="preserve"> </w:t>
-      </w:r>
-      <w:r>
-        <w:t xml:space="preserve">with a correction for the uneven number of meals per subject. A raw ICC near one</w:t>
-      </w:r>
-      <w:r>
-        <w:t xml:space="preserve"> </w:t>
-      </w:r>
-      <w:r>
-        <w:t xml:space="preserve">means the feature is highly repeatable within a person and separates people well.</w:t>
-      </w:r>
-    </w:p>
-    <w:p>
-      <w:pPr>
-        <w:pStyle w:val="BodyText"/>
-      </w:pPr>
-      <w:r>
-        <w:t xml:space="preserve">A raw ICC can partly reflect demographics rather than anything truly individual,</w:t>
-      </w:r>
-      <w:r>
-        <w:t xml:space="preserve"> </w:t>
-      </w:r>
-      <w:r>
-        <w:t xml:space="preserve">since older or heavier people tend to run higher glucose and that shows up as</w:t>
-      </w:r>
-      <w:r>
-        <w:t xml:space="preserve"> </w:t>
-      </w:r>
-      <w:r>
-        <w:t xml:space="preserve">between-subject variance. To separate the two, we regress each feature on a set</w:t>
-      </w:r>
-      <w:r>
-        <w:t xml:space="preserve"> </w:t>
-      </w:r>
-      <w:r>
-        <w:t xml:space="preserve">of covariates and recompute the ICC on the residuals. The covariates are the</w:t>
-      </w:r>
-      <w:r>
-        <w:t xml:space="preserve"> </w:t>
-      </w:r>
-      <w:r>
-        <w:t xml:space="preserve">fourteen numeric fields in the subject panel (age, body-mass index, weight,</w:t>
-      </w:r>
-      <w:r>
-        <w:t xml:space="preserve"> </w:t>
-      </w:r>
-      <w:r>
-        <w:t xml:space="preserve">height, HbA1c, fasting glucose, insulin, and the full lipid profile) together</w:t>
-      </w:r>
-      <w:r>
-        <w:t xml:space="preserve"> </w:t>
-      </w:r>
-      <w:r>
-        <w:t xml:space="preserve">with one-hot encodings of sex and self-identified ethnicity. What survives this</w:t>
-      </w:r>
-      <w:r>
-        <w:t xml:space="preserve"> </w:t>
-      </w:r>
-      <w:r>
-        <w:t xml:space="preserve">adjustment is individuality that age, body size, and blood chemistry do not</w:t>
-      </w:r>
-      <w:r>
-        <w:t xml:space="preserve"> </w:t>
-      </w:r>
-      <w:r>
-        <w:t xml:space="preserve">explain. We attach a 95% confidence interval to each adjusted ICC with a cluster</w:t>
-      </w:r>
-      <w:r>
-        <w:t xml:space="preserve"> </w:t>
-      </w:r>
-      <w:r>
-        <w:t xml:space="preserve">bootstrap that resamples subjects with replacement 800 times, keeping each</w:t>
-      </w:r>
-      <w:r>
-        <w:t xml:space="preserve"> </w:t>
-      </w:r>
-      <w:r>
-        <w:t xml:space="preserve">person’s meals together.</w:t>
-      </w:r>
-    </w:p>
-    <w:bookmarkEnd w:id="13"/>
-    <w:bookmarkStart w:id="14" w:name="multivariate-fingerprinting"/>
-    <w:p>
-      <w:pPr>
-        <w:pStyle w:val="Heading3"/>
-      </w:pPr>
-      <w:r>
-        <w:t xml:space="preserve">Multivariate fingerprinting</w:t>
-      </w:r>
-    </w:p>
-    <w:p>
-      <w:pPr>
-        <w:pStyle w:val="FirstParagraph"/>
-      </w:pPr>
-      <w:r>
-        <w:t xml:space="preserve">The ICC looks at one feature at a time. To ask whether the whole excursion</w:t>
-      </w:r>
-      <w:r>
-        <w:t xml:space="preserve"> </w:t>
-      </w:r>
-      <w:r>
-        <w:t xml:space="preserve">profile clusters by person, we residualize all ten features against the same</w:t>
-      </w:r>
-      <w:r>
-        <w:t xml:space="preserve"> </w:t>
-      </w:r>
-      <w:r>
-        <w:t xml:space="preserve">covariates, standardize them, and measure the cosine distance between every pair</w:t>
-      </w:r>
-      <w:r>
-        <w:t xml:space="preserve"> </w:t>
-      </w:r>
-      <w:r>
-        <w:t xml:space="preserve">of meals. If meals carry an individual signature, two meals from the same person</w:t>
-      </w:r>
-      <w:r>
-        <w:t xml:space="preserve"> </w:t>
-      </w:r>
-      <w:r>
-        <w:t xml:space="preserve">should sit closer together than two meals from different people. We compare the</w:t>
-      </w:r>
-      <w:r>
-        <w:t xml:space="preserve"> </w:t>
-      </w:r>
-      <w:r>
-        <w:t xml:space="preserve">mean within-subject distance to the mean between-subject distance and summarize</w:t>
-      </w:r>
-      <w:r>
-        <w:t xml:space="preserve"> </w:t>
-      </w:r>
-      <w:r>
-        <w:t xml:space="preserve">the gap with Cohen’s d. Because the pairs are not independent, we test the gap</w:t>
-      </w:r>
-      <w:r>
-        <w:t xml:space="preserve"> </w:t>
-      </w:r>
-      <w:r>
-        <w:t xml:space="preserve">with a permutation test: we shuffle the subject labels 300 times and count how</w:t>
-      </w:r>
-      <w:r>
-        <w:t xml:space="preserve"> </w:t>
-      </w:r>
-      <w:r>
-        <w:t xml:space="preserve">often a reshuffled gap is at least as large as the observed one.</w:t>
-      </w:r>
-    </w:p>
-    <w:bookmarkEnd w:id="14"/>
-    <w:bookmarkStart w:id="15" w:name="re-identification"/>
-    <w:p>
-      <w:pPr>
-        <w:pStyle w:val="Heading3"/>
-      </w:pPr>
-      <w:r>
-        <w:t xml:space="preserve">Re-identification</w:t>
-      </w:r>
-    </w:p>
-    <w:p>
-      <w:pPr>
-        <w:pStyle w:val="FirstParagraph"/>
-      </w:pPr>
-      <w:r>
-        <w:t xml:space="preserve">Distances tell us that people separate, but not by how much in practical terms.</w:t>
-      </w:r>
-      <w:r>
-        <w:t xml:space="preserve"> </w:t>
-      </w:r>
-      <w:r>
-        <w:t xml:space="preserve">To put a number on it we set up a re-identification task. Each subject’s meals</w:t>
-      </w:r>
-      <w:r>
-        <w:t xml:space="preserve"> </w:t>
-      </w:r>
-      <w:r>
-        <w:t xml:space="preserve">are split, 80 percent into a gallery and 20 percent held out. A nearest-neighbour</w:t>
-      </w:r>
-      <w:r>
-        <w:t xml:space="preserve"> </w:t>
-      </w:r>
-      <w:r>
-        <w:t xml:space="preserve">model with ten neighbours and a cosine metric is fit on the residualized gallery</w:t>
-      </w:r>
-      <w:r>
-        <w:t xml:space="preserve"> </w:t>
-      </w:r>
-      <w:r>
-        <w:t xml:space="preserve">features, and we ask it to name the subject behind each held-out meal. We report</w:t>
-      </w:r>
-      <w:r>
-        <w:t xml:space="preserve"> </w:t>
-      </w:r>
-      <w:r>
-        <w:t xml:space="preserve">top-1 accuracy, whether the correct person is the first guess, and top-5</w:t>
-      </w:r>
-      <w:r>
-        <w:t xml:space="preserve"> </w:t>
-      </w:r>
-      <w:r>
-        <w:t xml:space="preserve">accuracy, whether the correct person is among the first five, each against the</w:t>
-      </w:r>
-      <w:r>
-        <w:t xml:space="preserve"> </w:t>
-      </w:r>
-      <w:r>
-        <w:t xml:space="preserve">chance rates of 1/45 and 5/45. We repeat this over 20 random gallery and probe</w:t>
-      </w:r>
-      <w:r>
-        <w:t xml:space="preserve"> </w:t>
-      </w:r>
-      <w:r>
-        <w:t xml:space="preserve">splits and report the mean.</w:t>
-      </w:r>
-    </w:p>
-    <w:bookmarkEnd w:id="15"/>
-    <w:bookmarkStart w:id="16" w:name="diabetes-classification"/>
-    <w:p>
-      <w:pPr>
-        <w:pStyle w:val="Heading3"/>
-      </w:pPr>
-      <w:r>
-        <w:t xml:space="preserve">Diabetes classification</w:t>
-      </w:r>
-    </w:p>
-    <w:p>
-      <w:pPr>
-        <w:pStyle w:val="FirstParagraph"/>
-      </w:pPr>
-      <w:r>
-        <w:t xml:space="preserve">Finally we test whether the same features predict diabetes. Subjects are labelled</w:t>
-      </w:r>
-      <w:r>
-        <w:t xml:space="preserve"> </w:t>
-      </w:r>
-      <w:r>
-        <w:t xml:space="preserve">diabetic if their HbA1c is at least 6.5 percent or their fasting glucose is at</w:t>
-      </w:r>
-      <w:r>
-        <w:t xml:space="preserve"> </w:t>
-      </w:r>
-      <w:r>
-        <w:t xml:space="preserve">least 126 mg/dL, following the ADA thresholds, and the label is carried down to</w:t>
-      </w:r>
-      <w:r>
-        <w:t xml:space="preserve"> </w:t>
-      </w:r>
-      <w:r>
-        <w:t xml:space="preserve">every meal from that subject. A logistic-regression classifier is trained on the</w:t>
-      </w:r>
-      <w:r>
-        <w:t xml:space="preserve"> </w:t>
-      </w:r>
-      <w:r>
-        <w:t xml:space="preserve">meal-level features after median imputation and standardization. Because meals</w:t>
-      </w:r>
-      <w:r>
-        <w:t xml:space="preserve"> </w:t>
-      </w:r>
-      <w:r>
-        <w:t xml:space="preserve">from one person are correlated, a random split would let the model recognize the</w:t>
-      </w:r>
-      <w:r>
-        <w:t xml:space="preserve"> </w:t>
-      </w:r>
-      <w:r>
-        <w:t xml:space="preserve">person instead of the condition, so we evaluate with five-fold cross-validation</w:t>
-      </w:r>
-      <w:r>
-        <w:t xml:space="preserve"> </w:t>
-      </w:r>
-      <w:r>
-        <w:t xml:space="preserve">grouped by subject, meaning every subject’s meals fall entirely in either the</w:t>
-      </w:r>
-      <w:r>
-        <w:t xml:space="preserve"> </w:t>
-      </w:r>
-      <w:r>
-        <w:t xml:space="preserve">training or the test fold. We read feature importance from the standardized</w:t>
-      </w:r>
-      <w:r>
-        <w:t xml:space="preserve"> </w:t>
-      </w:r>
-      <w:r>
-        <w:t xml:space="preserve">logistic-regression coefficients. To test whether the excursion shape predicts</w:t>
-      </w:r>
-      <w:r>
-        <w:t xml:space="preserve"> </w:t>
-      </w:r>
-      <w:r>
-        <w:t xml:space="preserve">beyond glucose level, we also re-run this classifier on feature subsets that drop</w:t>
-      </w:r>
-      <w:r>
-        <w:t xml:space="preserve"> </w:t>
-      </w:r>
-      <w:r>
-        <w:t xml:space="preserve">the amplitude features.</w:t>
-      </w:r>
-    </w:p>
-    <w:bookmarkEnd w:id="16"/>
-    <w:bookmarkStart w:id="17" w:name="implementation"/>
-    <w:p>
-      <w:pPr>
-        <w:pStyle w:val="Heading3"/>
-      </w:pPr>
-      <w:r>
-        <w:t xml:space="preserve">Implementation</w:t>
-      </w:r>
-    </w:p>
-    <w:p>
-      <w:pPr>
-        <w:pStyle w:val="FirstParagraph"/>
-      </w:pPr>
-      <w:r>
-        <w:t xml:space="preserve">All analyses use Python with scikit-learn (Pedregosa et al., 2011). Feature</w:t>
-      </w:r>
-      <w:r>
-        <w:t xml:space="preserve"> </w:t>
-      </w:r>
-      <w:r>
-        <w:t xml:space="preserve">extraction, the ICC and fingerprinting analyses, the re-identification model, and</w:t>
-      </w:r>
-      <w:r>
-        <w:t xml:space="preserve"> </w:t>
-      </w:r>
-      <w:r>
-        <w:t xml:space="preserve">the classifier are each a small script, and a single command runs the full</w:t>
-      </w:r>
-      <w:r>
-        <w:t xml:space="preserve"> </w:t>
-      </w:r>
-      <w:r>
-        <w:t xml:space="preserve">pipeline and prints the summary numbers. The CGMacros data is public but</w:t>
-      </w:r>
-      <w:r>
-        <w:t xml:space="preserve"> </w:t>
-      </w:r>
-      <w:r>
-        <w:t xml:space="preserve">is not redistributed here.</w:t>
-      </w:r>
-    </w:p>
-    <w:bookmarkEnd w:id="17"/>
-    <w:bookmarkEnd w:id="18"/>
-    <w:bookmarkStart w:id="31" w:name="results"/>
-    <w:p>
-      <w:pPr>
-        <w:pStyle w:val="Heading2"/>
-      </w:pPr>
-      <w:r>
-        <w:t xml:space="preserve">Results</w:t>
-      </w:r>
-    </w:p>
-    <w:bookmarkStart w:id="19" w:name="cohort"/>
-    <w:p>
-      <w:pPr>
-        <w:pStyle w:val="Heading3"/>
-      </w:pPr>
-      <w:r>
-        <w:t xml:space="preserve">Cohort</w:t>
-      </w:r>
-    </w:p>
-    <w:p>
-      <w:pPr>
-        <w:pStyle w:val="FirstParagraph"/>
-      </w:pPr>
-      <w:r>
-        <w:t xml:space="preserve">The pipeline extracts 1,657 meal excursions from 45 subjects. Applying the ADA</w:t>
-      </w:r>
-      <w:r>
-        <w:t xml:space="preserve"> </w:t>
-      </w:r>
-      <w:r>
-        <w:t xml:space="preserve">thresholds at the subject level labels 18 of the 45 as diabetic, so about 40</w:t>
-      </w:r>
-      <w:r>
-        <w:t xml:space="preserve"> </w:t>
-      </w:r>
-      <w:r>
-        <w:t xml:space="preserve">percent of the cohort, and every meal inherits its subject’s label. The</w:t>
-      </w:r>
-      <w:r>
-        <w:t xml:space="preserve"> </w:t>
-      </w:r>
-      <w:r>
-        <w:t xml:space="preserve">classification task below is therefore moderately imbalanced but not severely so.</w:t>
-      </w:r>
-    </w:p>
-    <w:bookmarkEnd w:id="19"/>
-    <w:bookmarkStart w:id="20" w:name="individuality-of-single-features"/>
-    <w:p>
-      <w:pPr>
-        <w:pStyle w:val="Heading3"/>
-      </w:pPr>
-      <w:r>
-        <w:t xml:space="preserve">Individuality of single features</w:t>
-      </w:r>
-    </w:p>
-    <w:p>
-      <w:pPr>
-        <w:pStyle w:val="FirstParagraph"/>
-      </w:pPr>
-      <w:r>
-        <w:t xml:space="preserve">The amplitude features are the most person-specific. Peak glucose has the highest</w:t>
-      </w:r>
-      <w:r>
-        <w:t xml:space="preserve"> </w:t>
-      </w:r>
-      <w:r>
-        <w:t xml:space="preserve">raw ICC at 0.65 and baseline glucose is next at 0.56, meaning that most of the</w:t>
-      </w:r>
-      <w:r>
-        <w:t xml:space="preserve"> </w:t>
-      </w:r>
-      <w:r>
-        <w:t xml:space="preserve">variance in these features is between people rather than within a person across</w:t>
-      </w:r>
-      <w:r>
-        <w:t xml:space="preserve"> </w:t>
-      </w:r>
-      <w:r>
-        <w:t xml:space="preserve">meals. Timing and distribution-shape features sit much lower, mostly under 0.15.</w:t>
-      </w:r>
-      <w:r>
-        <w:t xml:space="preserve"> </w:t>
-      </w:r>
-      <w:r>
-        <w:t xml:space="preserve">Adjusting for the covariates shrinks every ICC, as expected, but does not erase</w:t>
-      </w:r>
-      <w:r>
-        <w:t xml:space="preserve"> </w:t>
-      </w:r>
-      <w:r>
-        <w:t xml:space="preserve">the leaders: peak and baseline glucose keep adjusted ICCs of 0.24 (95% CI 0.15 to</w:t>
-      </w:r>
-      <w:r>
-        <w:t xml:space="preserve"> </w:t>
-      </w:r>
-      <w:r>
-        <w:t xml:space="preserve">0.33) and 0.20 (0.10 to 0.30). In</w:t>
-      </w:r>
-      <w:r>
-        <w:t xml:space="preserve"> </w:t>
-      </w:r>
-      <w:r>
-        <w:t xml:space="preserve">other words, part of what makes two people’s meal responses differ in height is</w:t>
-      </w:r>
-      <w:r>
-        <w:t xml:space="preserve"> </w:t>
-      </w:r>
-      <w:r>
-        <w:t xml:space="preserve">not explained by their age, body size, or blood chemistry.</w:t>
-      </w:r>
-    </w:p>
-    <w:bookmarkEnd w:id="20"/>
-    <w:bookmarkStart w:id="24" w:name="profiles-cluster-by-person"/>
-    <w:p>
-      <w:pPr>
-        <w:pStyle w:val="Heading3"/>
-      </w:pPr>
-      <w:r>
-        <w:t xml:space="preserve">Profiles cluster by person</w:t>
-      </w:r>
-    </w:p>
-    <w:p>
-      <w:pPr>
-        <w:pStyle w:val="FirstParagraph"/>
-      </w:pPr>
-      <w:r>
-        <w:t xml:space="preserve">Looking at all ten features together tells the same story. After residualizing</w:t>
-      </w:r>
-      <w:r>
-        <w:t xml:space="preserve"> </w:t>
-      </w:r>
-      <w:r>
-        <w:t xml:space="preserve">against the covariates, the mean cosine distance between two meals from the same</w:t>
-      </w:r>
-      <w:r>
-        <w:t xml:space="preserve"> </w:t>
-      </w:r>
-      <w:r>
-        <w:t xml:space="preserve">person is 0.912, smaller than the 0.998 between meals from different people. The</w:t>
-      </w:r>
-      <w:r>
-        <w:t xml:space="preserve"> </w:t>
-      </w:r>
-      <w:r>
-        <w:t xml:space="preserve">gap is a small effect by Cohen’s conventions, d = 0.18, but the permutation test</w:t>
-      </w:r>
-      <w:r>
-        <w:t xml:space="preserve"> </w:t>
-      </w:r>
-      <w:r>
-        <w:t xml:space="preserve">rules out chance, with p = 0.003 across 300 shuffles of the subject labels. So</w:t>
-      </w:r>
-      <w:r>
-        <w:t xml:space="preserve"> </w:t>
-      </w:r>
-      <w:r>
-        <w:t xml:space="preserve">the individual signal is modest in size yet reliably present once demographics</w:t>
-      </w:r>
-      <w:r>
-        <w:t xml:space="preserve"> </w:t>
-      </w:r>
-      <w:r>
-        <w:t xml:space="preserve">and labs are removed (Figure 1).</w:t>
       </w:r>
     </w:p>
     <w:p>
@@ -1298,20 +744,693 @@
       <w:r>
         <w:drawing>
           <wp:inline>
-            <wp:extent cx="5181600" cy="3944112"/>
+            <wp:extent cx="4224528" cy="2712720"/>
             <wp:effectExtent b="0" l="0" r="0" t="0"/>
-            <wp:docPr descr="Figure 1" title="" id="22" name="Picture"/>
+            <wp:docPr descr="Figure 1" title="" id="13" name="Picture"/>
             <a:graphic>
               <a:graphicData uri="http://schemas.openxmlformats.org/drawingml/2006/picture">
                 <pic:pic>
                   <pic:nvPicPr>
-                    <pic:cNvPr descr="figures/fig1-distance.png" id="23" name="Picture"/>
+                    <pic:cNvPr descr="figures/fig-window.png" id="14" name="Picture"/>
                     <pic:cNvPicPr>
                       <a:picLocks noChangeArrowheads="1" noChangeAspect="1"/>
                     </pic:cNvPicPr>
                   </pic:nvPicPr>
                   <pic:blipFill>
-                    <a:blip r:embed="rId21"/>
+                    <a:blip r:embed="rId12"/>
+                    <a:stretch>
+                      <a:fillRect/>
+                    </a:stretch>
+                  </pic:blipFill>
+                  <pic:spPr bwMode="auto">
+                    <a:xfrm>
+                      <a:off x="0" y="0"/>
+                      <a:ext cx="4224528" cy="2712720"/>
+                    </a:xfrm>
+                    <a:prstGeom prst="rect">
+                      <a:avLst/>
+                    </a:prstGeom>
+                    <a:noFill/>
+                    <a:ln w="9525">
+                      <a:noFill/>
+                      <a:headEnd/>
+                      <a:tailEnd/>
+                    </a:ln>
+                  </pic:spPr>
+                </pic:pic>
+              </a:graphicData>
+            </a:graphic>
+          </wp:inline>
+        </w:drawing>
+      </w:r>
+    </w:p>
+    <w:p>
+      <w:pPr>
+        <w:pStyle w:val="ImageCaption"/>
+      </w:pPr>
+      <w:r>
+        <w:t xml:space="preserve">Figure 1</w:t>
+      </w:r>
+    </w:p>
+    <w:p>
+      <w:pPr>
+        <w:pStyle w:val="BodyText"/>
+      </w:pPr>
+      <w:r>
+        <w:rPr>
+          <w:i/>
+          <w:iCs/>
+        </w:rPr>
+        <w:t xml:space="preserve">Figure 1. An example postprandial excursion, the mean meal response of one</w:t>
+      </w:r>
+      <w:r>
+        <w:rPr>
+          <w:i/>
+          <w:iCs/>
+        </w:rPr>
+        <w:t xml:space="preserve"> </w:t>
+      </w:r>
+      <w:r>
+        <w:rPr>
+          <w:i/>
+          <w:iCs/>
+        </w:rPr>
+        <w:t xml:space="preserve">subject, with the pre-meal baseline and the peak marked. The ten features are</w:t>
+      </w:r>
+      <w:r>
+        <w:rPr>
+          <w:i/>
+          <w:iCs/>
+        </w:rPr>
+        <w:t xml:space="preserve"> </w:t>
+      </w:r>
+      <w:r>
+        <w:rPr>
+          <w:i/>
+          <w:iCs/>
+        </w:rPr>
+        <w:t xml:space="preserve">read off this curve.</w:t>
+      </w:r>
+    </w:p>
+    <w:p>
+      <w:pPr>
+        <w:pStyle w:val="BodyText"/>
+      </w:pPr>
+      <w:r>
+        <w:t xml:space="preserve">From each window we compute ten features that summarize the curve rather than a</w:t>
+      </w:r>
+      <w:r>
+        <w:t xml:space="preserve"> </w:t>
+      </w:r>
+      <w:r>
+        <w:t xml:space="preserve">single average. Four are amplitude features (pre-meal baseline, peak, the rise</w:t>
+      </w:r>
+      <w:r>
+        <w:t xml:space="preserve"> </w:t>
+      </w:r>
+      <w:r>
+        <w:t xml:space="preserve">from baseline to peak, and the area above baseline), two are timing features</w:t>
+      </w:r>
+      <w:r>
+        <w:t xml:space="preserve"> </w:t>
+      </w:r>
+      <w:r>
+        <w:t xml:space="preserve">(time to peak and time back to baseline), two are kinetic (the average up-slope</w:t>
+      </w:r>
+      <w:r>
+        <w:t xml:space="preserve"> </w:t>
+      </w:r>
+      <w:r>
+        <w:t xml:space="preserve">and down-slope), and two describe the distribution of glucose in the window</w:t>
+      </w:r>
+      <w:r>
+        <w:t xml:space="preserve"> </w:t>
+      </w:r>
+      <w:r>
+        <w:t xml:space="preserve">(skewness and kurtosis). The result is one row per meal, which the later analyses</w:t>
+      </w:r>
+      <w:r>
+        <w:t xml:space="preserve"> </w:t>
+      </w:r>
+      <w:r>
+        <w:t xml:space="preserve">treat as a repeated measurement of the person who ate it.</w:t>
+      </w:r>
+    </w:p>
+    <w:bookmarkEnd w:id="15"/>
+    <w:bookmarkStart w:id="16" w:name="covariate-adjusted-individuality"/>
+    <w:p>
+      <w:pPr>
+        <w:pStyle w:val="Heading3"/>
+      </w:pPr>
+      <w:r>
+        <w:t xml:space="preserve">Covariate-adjusted individuality</w:t>
+      </w:r>
+    </w:p>
+    <w:p>
+      <w:pPr>
+        <w:pStyle w:val="FirstParagraph"/>
+      </w:pPr>
+      <w:r>
+        <w:t xml:space="preserve">For each feature we first ask how much of its variance is between people rather</w:t>
+      </w:r>
+      <w:r>
+        <w:t xml:space="preserve"> </w:t>
+      </w:r>
+      <w:r>
+        <w:t xml:space="preserve">than within a person across meals. We use the intraclass correlation coefficient</w:t>
+      </w:r>
+      <w:r>
+        <w:t xml:space="preserve"> </w:t>
+      </w:r>
+      <w:r>
+        <w:t xml:space="preserve">in its one-way form, computed from the between- and within-subject mean squares</w:t>
+      </w:r>
+      <w:r>
+        <w:t xml:space="preserve"> </w:t>
+      </w:r>
+      <w:r>
+        <w:t xml:space="preserve">with a correction for the uneven number of meals per subject. A raw ICC near one</w:t>
+      </w:r>
+      <w:r>
+        <w:t xml:space="preserve"> </w:t>
+      </w:r>
+      <w:r>
+        <w:t xml:space="preserve">means the feature is highly repeatable within a person and separates people well.</w:t>
+      </w:r>
+    </w:p>
+    <w:p>
+      <w:pPr>
+        <w:pStyle w:val="BodyText"/>
+      </w:pPr>
+      <w:r>
+        <w:t xml:space="preserve">A raw ICC can partly reflect demographics rather than anything truly individual,</w:t>
+      </w:r>
+      <w:r>
+        <w:t xml:space="preserve"> </w:t>
+      </w:r>
+      <w:r>
+        <w:t xml:space="preserve">since older or heavier people tend to run higher glucose and that shows up as</w:t>
+      </w:r>
+      <w:r>
+        <w:t xml:space="preserve"> </w:t>
+      </w:r>
+      <w:r>
+        <w:t xml:space="preserve">between-subject variance. To separate the two, we regress each feature on a set</w:t>
+      </w:r>
+      <w:r>
+        <w:t xml:space="preserve"> </w:t>
+      </w:r>
+      <w:r>
+        <w:t xml:space="preserve">of covariates and recompute the ICC on the residuals. The covariates are the</w:t>
+      </w:r>
+      <w:r>
+        <w:t xml:space="preserve"> </w:t>
+      </w:r>
+      <w:r>
+        <w:t xml:space="preserve">fourteen numeric fields in the subject panel (age, body-mass index, weight,</w:t>
+      </w:r>
+      <w:r>
+        <w:t xml:space="preserve"> </w:t>
+      </w:r>
+      <w:r>
+        <w:t xml:space="preserve">height, HbA1c, fasting glucose, insulin, and the full lipid profile) together</w:t>
+      </w:r>
+      <w:r>
+        <w:t xml:space="preserve"> </w:t>
+      </w:r>
+      <w:r>
+        <w:t xml:space="preserve">with one-hot encodings of sex and self-identified ethnicity. What survives this</w:t>
+      </w:r>
+      <w:r>
+        <w:t xml:space="preserve"> </w:t>
+      </w:r>
+      <w:r>
+        <w:t xml:space="preserve">adjustment is individuality that age, body size, and blood chemistry do not</w:t>
+      </w:r>
+      <w:r>
+        <w:t xml:space="preserve"> </w:t>
+      </w:r>
+      <w:r>
+        <w:t xml:space="preserve">explain. We attach a 95% confidence interval to each adjusted ICC with a cluster</w:t>
+      </w:r>
+      <w:r>
+        <w:t xml:space="preserve"> </w:t>
+      </w:r>
+      <w:r>
+        <w:t xml:space="preserve">bootstrap that resamples subjects with replacement 800 times, keeping each</w:t>
+      </w:r>
+      <w:r>
+        <w:t xml:space="preserve"> </w:t>
+      </w:r>
+      <w:r>
+        <w:t xml:space="preserve">person’s meals together.</w:t>
+      </w:r>
+    </w:p>
+    <w:bookmarkEnd w:id="16"/>
+    <w:bookmarkStart w:id="17" w:name="multivariate-fingerprinting"/>
+    <w:p>
+      <w:pPr>
+        <w:pStyle w:val="Heading3"/>
+      </w:pPr>
+      <w:r>
+        <w:t xml:space="preserve">Multivariate fingerprinting</w:t>
+      </w:r>
+    </w:p>
+    <w:p>
+      <w:pPr>
+        <w:pStyle w:val="FirstParagraph"/>
+      </w:pPr>
+      <w:r>
+        <w:t xml:space="preserve">The ICC looks at one feature at a time. To ask whether the whole excursion</w:t>
+      </w:r>
+      <w:r>
+        <w:t xml:space="preserve"> </w:t>
+      </w:r>
+      <w:r>
+        <w:t xml:space="preserve">profile clusters by person, we residualize all ten features against the same</w:t>
+      </w:r>
+      <w:r>
+        <w:t xml:space="preserve"> </w:t>
+      </w:r>
+      <w:r>
+        <w:t xml:space="preserve">covariates, standardize them, and measure the cosine distance between every pair</w:t>
+      </w:r>
+      <w:r>
+        <w:t xml:space="preserve"> </w:t>
+      </w:r>
+      <w:r>
+        <w:t xml:space="preserve">of meals. If meals carry an individual signature, two meals from the same person</w:t>
+      </w:r>
+      <w:r>
+        <w:t xml:space="preserve"> </w:t>
+      </w:r>
+      <w:r>
+        <w:t xml:space="preserve">should sit closer together than two meals from different people. We compare the</w:t>
+      </w:r>
+      <w:r>
+        <w:t xml:space="preserve"> </w:t>
+      </w:r>
+      <w:r>
+        <w:t xml:space="preserve">mean within-subject distance to the mean between-subject distance and summarize</w:t>
+      </w:r>
+      <w:r>
+        <w:t xml:space="preserve"> </w:t>
+      </w:r>
+      <w:r>
+        <w:t xml:space="preserve">the gap with Cohen’s d. Because the pairs are not independent, we test the gap</w:t>
+      </w:r>
+      <w:r>
+        <w:t xml:space="preserve"> </w:t>
+      </w:r>
+      <w:r>
+        <w:t xml:space="preserve">with a permutation test: we shuffle the subject labels 300 times and count how</w:t>
+      </w:r>
+      <w:r>
+        <w:t xml:space="preserve"> </w:t>
+      </w:r>
+      <w:r>
+        <w:t xml:space="preserve">often a reshuffled gap is at least as large as the observed one.</w:t>
+      </w:r>
+    </w:p>
+    <w:bookmarkEnd w:id="17"/>
+    <w:bookmarkStart w:id="18" w:name="re-identification"/>
+    <w:p>
+      <w:pPr>
+        <w:pStyle w:val="Heading3"/>
+      </w:pPr>
+      <w:r>
+        <w:t xml:space="preserve">Re-identification</w:t>
+      </w:r>
+    </w:p>
+    <w:p>
+      <w:pPr>
+        <w:pStyle w:val="FirstParagraph"/>
+      </w:pPr>
+      <w:r>
+        <w:t xml:space="preserve">Distances tell us that people separate, but not by how much in practical terms.</w:t>
+      </w:r>
+      <w:r>
+        <w:t xml:space="preserve"> </w:t>
+      </w:r>
+      <w:r>
+        <w:t xml:space="preserve">To put a number on it we set up a re-identification task. Each subject’s meals</w:t>
+      </w:r>
+      <w:r>
+        <w:t xml:space="preserve"> </w:t>
+      </w:r>
+      <w:r>
+        <w:t xml:space="preserve">are split, 80 percent into a gallery and 20 percent held out. A nearest-neighbour</w:t>
+      </w:r>
+      <w:r>
+        <w:t xml:space="preserve"> </w:t>
+      </w:r>
+      <w:r>
+        <w:t xml:space="preserve">model with ten neighbours and a cosine metric is fit on the residualized gallery</w:t>
+      </w:r>
+      <w:r>
+        <w:t xml:space="preserve"> </w:t>
+      </w:r>
+      <w:r>
+        <w:t xml:space="preserve">features, and we ask it to name the subject behind each held-out meal. We report</w:t>
+      </w:r>
+      <w:r>
+        <w:t xml:space="preserve"> </w:t>
+      </w:r>
+      <w:r>
+        <w:t xml:space="preserve">top-1 accuracy, whether the correct person is the first guess, and top-5</w:t>
+      </w:r>
+      <w:r>
+        <w:t xml:space="preserve"> </w:t>
+      </w:r>
+      <w:r>
+        <w:t xml:space="preserve">accuracy, whether the correct person is among the first five, each against the</w:t>
+      </w:r>
+      <w:r>
+        <w:t xml:space="preserve"> </w:t>
+      </w:r>
+      <w:r>
+        <w:t xml:space="preserve">chance rates of 1/45 and 5/45. We repeat this over 20 random gallery and probe</w:t>
+      </w:r>
+      <w:r>
+        <w:t xml:space="preserve"> </w:t>
+      </w:r>
+      <w:r>
+        <w:t xml:space="preserve">splits and report the mean.</w:t>
+      </w:r>
+    </w:p>
+    <w:bookmarkEnd w:id="18"/>
+    <w:bookmarkStart w:id="19" w:name="diabetes-classification"/>
+    <w:p>
+      <w:pPr>
+        <w:pStyle w:val="Heading3"/>
+      </w:pPr>
+      <w:r>
+        <w:t xml:space="preserve">Diabetes classification</w:t>
+      </w:r>
+    </w:p>
+    <w:p>
+      <w:pPr>
+        <w:pStyle w:val="FirstParagraph"/>
+      </w:pPr>
+      <w:r>
+        <w:t xml:space="preserve">Finally we test whether the same features predict diabetes. Subjects are labelled</w:t>
+      </w:r>
+      <w:r>
+        <w:t xml:space="preserve"> </w:t>
+      </w:r>
+      <w:r>
+        <w:t xml:space="preserve">diabetic if their HbA1c is at least 6.5 percent or their fasting glucose is at</w:t>
+      </w:r>
+      <w:r>
+        <w:t xml:space="preserve"> </w:t>
+      </w:r>
+      <w:r>
+        <w:t xml:space="preserve">least 126 mg/dL, following the ADA thresholds, and the label is carried down to</w:t>
+      </w:r>
+      <w:r>
+        <w:t xml:space="preserve"> </w:t>
+      </w:r>
+      <w:r>
+        <w:t xml:space="preserve">every meal from that subject. A logistic-regression classifier is trained on the</w:t>
+      </w:r>
+      <w:r>
+        <w:t xml:space="preserve"> </w:t>
+      </w:r>
+      <w:r>
+        <w:t xml:space="preserve">meal-level features after median imputation and standardization. Because meals</w:t>
+      </w:r>
+      <w:r>
+        <w:t xml:space="preserve"> </w:t>
+      </w:r>
+      <w:r>
+        <w:t xml:space="preserve">from one person are correlated, a random split would let the model recognize the</w:t>
+      </w:r>
+      <w:r>
+        <w:t xml:space="preserve"> </w:t>
+      </w:r>
+      <w:r>
+        <w:t xml:space="preserve">person instead of the condition, so we evaluate with five-fold cross-validation</w:t>
+      </w:r>
+      <w:r>
+        <w:t xml:space="preserve"> </w:t>
+      </w:r>
+      <w:r>
+        <w:t xml:space="preserve">grouped by subject, meaning every subject’s meals fall entirely in either the</w:t>
+      </w:r>
+      <w:r>
+        <w:t xml:space="preserve"> </w:t>
+      </w:r>
+      <w:r>
+        <w:t xml:space="preserve">training or the test fold. We read feature importance from the standardized</w:t>
+      </w:r>
+      <w:r>
+        <w:t xml:space="preserve"> </w:t>
+      </w:r>
+      <w:r>
+        <w:t xml:space="preserve">logistic-regression coefficients. To test whether the excursion shape predicts</w:t>
+      </w:r>
+      <w:r>
+        <w:t xml:space="preserve"> </w:t>
+      </w:r>
+      <w:r>
+        <w:t xml:space="preserve">beyond glucose level, we also re-run this classifier on feature subsets that drop</w:t>
+      </w:r>
+      <w:r>
+        <w:t xml:space="preserve"> </w:t>
+      </w:r>
+      <w:r>
+        <w:t xml:space="preserve">the amplitude features.</w:t>
+      </w:r>
+    </w:p>
+    <w:bookmarkEnd w:id="19"/>
+    <w:bookmarkStart w:id="20" w:name="implementation"/>
+    <w:p>
+      <w:pPr>
+        <w:pStyle w:val="Heading3"/>
+      </w:pPr>
+      <w:r>
+        <w:t xml:space="preserve">Implementation</w:t>
+      </w:r>
+    </w:p>
+    <w:p>
+      <w:pPr>
+        <w:pStyle w:val="FirstParagraph"/>
+      </w:pPr>
+      <w:r>
+        <w:t xml:space="preserve">All analyses use Python with scikit-learn (Pedregosa et al., 2011). Feature</w:t>
+      </w:r>
+      <w:r>
+        <w:t xml:space="preserve"> </w:t>
+      </w:r>
+      <w:r>
+        <w:t xml:space="preserve">extraction, the ICC and fingerprinting analyses, the re-identification model, and</w:t>
+      </w:r>
+      <w:r>
+        <w:t xml:space="preserve"> </w:t>
+      </w:r>
+      <w:r>
+        <w:t xml:space="preserve">the classifier are each a small script, and a single command runs the full</w:t>
+      </w:r>
+      <w:r>
+        <w:t xml:space="preserve"> </w:t>
+      </w:r>
+      <w:r>
+        <w:t xml:space="preserve">pipeline and prints the summary numbers. The CGMacros data is public but</w:t>
+      </w:r>
+      <w:r>
+        <w:t xml:space="preserve"> </w:t>
+      </w:r>
+      <w:r>
+        <w:t xml:space="preserve">is not redistributed here.</w:t>
+      </w:r>
+    </w:p>
+    <w:bookmarkEnd w:id="20"/>
+    <w:bookmarkEnd w:id="21"/>
+    <w:bookmarkStart w:id="34" w:name="results"/>
+    <w:p>
+      <w:pPr>
+        <w:pStyle w:val="Heading2"/>
+      </w:pPr>
+      <w:r>
+        <w:t xml:space="preserve">Results</w:t>
+      </w:r>
+    </w:p>
+    <w:bookmarkStart w:id="22" w:name="cohort"/>
+    <w:p>
+      <w:pPr>
+        <w:pStyle w:val="Heading3"/>
+      </w:pPr>
+      <w:r>
+        <w:t xml:space="preserve">Cohort</w:t>
+      </w:r>
+    </w:p>
+    <w:p>
+      <w:pPr>
+        <w:pStyle w:val="FirstParagraph"/>
+      </w:pPr>
+      <w:r>
+        <w:t xml:space="preserve">The pipeline extracts 1,657 meal excursions from 45 subjects. Applying the ADA</w:t>
+      </w:r>
+      <w:r>
+        <w:t xml:space="preserve"> </w:t>
+      </w:r>
+      <w:r>
+        <w:t xml:space="preserve">thresholds at the subject level labels 18 of the 45 as diabetic, so about 40</w:t>
+      </w:r>
+      <w:r>
+        <w:t xml:space="preserve"> </w:t>
+      </w:r>
+      <w:r>
+        <w:t xml:space="preserve">percent of the cohort, and every meal inherits its subject’s label. The</w:t>
+      </w:r>
+      <w:r>
+        <w:t xml:space="preserve"> </w:t>
+      </w:r>
+      <w:r>
+        <w:t xml:space="preserve">classification task below is therefore moderately imbalanced but not severely so.</w:t>
+      </w:r>
+    </w:p>
+    <w:bookmarkEnd w:id="22"/>
+    <w:bookmarkStart w:id="23" w:name="individuality-of-single-features"/>
+    <w:p>
+      <w:pPr>
+        <w:pStyle w:val="Heading3"/>
+      </w:pPr>
+      <w:r>
+        <w:t xml:space="preserve">Individuality of single features</w:t>
+      </w:r>
+    </w:p>
+    <w:p>
+      <w:pPr>
+        <w:pStyle w:val="FirstParagraph"/>
+      </w:pPr>
+      <w:r>
+        <w:t xml:space="preserve">The amplitude features are the most person-specific. Peak glucose has the highest</w:t>
+      </w:r>
+      <w:r>
+        <w:t xml:space="preserve"> </w:t>
+      </w:r>
+      <w:r>
+        <w:t xml:space="preserve">raw ICC at 0.65 and baseline glucose is next at 0.56, meaning that most of the</w:t>
+      </w:r>
+      <w:r>
+        <w:t xml:space="preserve"> </w:t>
+      </w:r>
+      <w:r>
+        <w:t xml:space="preserve">variance in these features is between people rather than within a person across</w:t>
+      </w:r>
+      <w:r>
+        <w:t xml:space="preserve"> </w:t>
+      </w:r>
+      <w:r>
+        <w:t xml:space="preserve">meals. Timing and distribution-shape features sit much lower, mostly under 0.15.</w:t>
+      </w:r>
+      <w:r>
+        <w:t xml:space="preserve"> </w:t>
+      </w:r>
+      <w:r>
+        <w:t xml:space="preserve">Adjusting for the covariates shrinks every ICC, as expected, but does not erase</w:t>
+      </w:r>
+      <w:r>
+        <w:t xml:space="preserve"> </w:t>
+      </w:r>
+      <w:r>
+        <w:t xml:space="preserve">the leaders: peak and baseline glucose keep adjusted ICCs of 0.24 (95% CI 0.15 to</w:t>
+      </w:r>
+      <w:r>
+        <w:t xml:space="preserve"> </w:t>
+      </w:r>
+      <w:r>
+        <w:t xml:space="preserve">0.33) and 0.20 (0.10 to 0.30). In</w:t>
+      </w:r>
+      <w:r>
+        <w:t xml:space="preserve"> </w:t>
+      </w:r>
+      <w:r>
+        <w:t xml:space="preserve">other words, part of what makes two people’s meal responses differ in height is</w:t>
+      </w:r>
+      <w:r>
+        <w:t xml:space="preserve"> </w:t>
+      </w:r>
+      <w:r>
+        <w:t xml:space="preserve">not explained by their age, body size, or blood chemistry.</w:t>
+      </w:r>
+    </w:p>
+    <w:bookmarkEnd w:id="23"/>
+    <w:bookmarkStart w:id="27" w:name="profiles-cluster-by-person"/>
+    <w:p>
+      <w:pPr>
+        <w:pStyle w:val="Heading3"/>
+      </w:pPr>
+      <w:r>
+        <w:t xml:space="preserve">Profiles cluster by person</w:t>
+      </w:r>
+    </w:p>
+    <w:p>
+      <w:pPr>
+        <w:pStyle w:val="FirstParagraph"/>
+      </w:pPr>
+      <w:r>
+        <w:t xml:space="preserve">Looking at all ten features together tells the same story. After residualizing</w:t>
+      </w:r>
+      <w:r>
+        <w:t xml:space="preserve"> </w:t>
+      </w:r>
+      <w:r>
+        <w:t xml:space="preserve">against the covariates, the mean cosine distance between two meals from the same</w:t>
+      </w:r>
+      <w:r>
+        <w:t xml:space="preserve"> </w:t>
+      </w:r>
+      <w:r>
+        <w:t xml:space="preserve">person is 0.912, smaller than the 0.998 between meals from different people. The</w:t>
+      </w:r>
+      <w:r>
+        <w:t xml:space="preserve"> </w:t>
+      </w:r>
+      <w:r>
+        <w:t xml:space="preserve">gap is a small effect by Cohen’s conventions, d = 0.18, but the permutation test</w:t>
+      </w:r>
+      <w:r>
+        <w:t xml:space="preserve"> </w:t>
+      </w:r>
+      <w:r>
+        <w:t xml:space="preserve">rules out chance, with p = 0.003 across 300 shuffles of the subject labels. So</w:t>
+      </w:r>
+      <w:r>
+        <w:t xml:space="preserve"> </w:t>
+      </w:r>
+      <w:r>
+        <w:t xml:space="preserve">the individual signal is modest in size yet reliably present once demographics</w:t>
+      </w:r>
+      <w:r>
+        <w:t xml:space="preserve"> </w:t>
+      </w:r>
+      <w:r>
+        <w:t xml:space="preserve">and labs are removed (Figure 2).</w:t>
+      </w:r>
+    </w:p>
+    <w:p>
+      <w:pPr>
+        <w:pStyle w:val="CaptionedFigure"/>
+      </w:pPr>
+      <w:r>
+        <w:drawing>
+          <wp:inline>
+            <wp:extent cx="5181600" cy="3944112"/>
+            <wp:effectExtent b="0" l="0" r="0" t="0"/>
+            <wp:docPr descr="Figure 2" title="" id="25" name="Picture"/>
+            <a:graphic>
+              <a:graphicData uri="http://schemas.openxmlformats.org/drawingml/2006/picture">
+                <pic:pic>
+                  <pic:nvPicPr>
+                    <pic:cNvPr descr="figures/fig1-distance.png" id="26" name="Picture"/>
+                    <pic:cNvPicPr>
+                      <a:picLocks noChangeArrowheads="1" noChangeAspect="1"/>
+                    </pic:cNvPicPr>
+                  </pic:nvPicPr>
+                  <pic:blipFill>
+                    <a:blip r:embed="rId24"/>
                     <a:stretch>
                       <a:fillRect/>
                     </a:stretch>
@@ -1343,7 +1462,7 @@
         <w:pStyle w:val="ImageCaption"/>
       </w:pPr>
       <w:r>
-        <w:t xml:space="preserve">Figure 1</w:t>
+        <w:t xml:space="preserve">Figure 2</w:t>
       </w:r>
     </w:p>
     <w:p>
@@ -1355,7 +1474,7 @@
           <w:i/>
           <w:iCs/>
         </w:rPr>
-        <w:t xml:space="preserve">Figure 1. Cosine distances between meals in the residualized feature space.</w:t>
+        <w:t xml:space="preserve">Figure 2. Cosine distances between meals in the residualized feature space.</w:t>
       </w:r>
       <w:r>
         <w:rPr>
@@ -1372,8 +1491,8 @@
         <w:t xml:space="preserve">Within-subject pairs sit closer than between-subject pairs.</w:t>
       </w:r>
     </w:p>
-    <w:bookmarkEnd w:id="24"/>
-    <w:bookmarkStart w:id="25" w:name="re-identification-1"/>
+    <w:bookmarkEnd w:id="27"/>
+    <w:bookmarkStart w:id="28" w:name="re-identification-1"/>
     <w:p>
       <w:pPr>
         <w:pStyle w:val="Heading3"/>
@@ -1432,8 +1551,8 @@
         <w:t xml:space="preserve">who produced it.</w:t>
       </w:r>
     </w:p>
-    <w:bookmarkEnd w:id="25"/>
-    <w:bookmarkStart w:id="29" w:name="diabetes-classification-1"/>
+    <w:bookmarkEnd w:id="28"/>
+    <w:bookmarkStart w:id="32" w:name="diabetes-classification-1"/>
     <w:p>
       <w:pPr>
         <w:pStyle w:val="Heading3"/>
@@ -1483,7 +1602,7 @@
         <w:t xml:space="preserve"> </w:t>
       </w:r>
       <w:r>
-        <w:t xml:space="preserve">contributing little on their own (Figure 2).</w:t>
+        <w:t xml:space="preserve">contributing little on their own (Figure 3).</w:t>
       </w:r>
     </w:p>
     <w:p>
@@ -1495,18 +1614,18 @@
           <wp:inline>
             <wp:extent cx="5334000" cy="3667479"/>
             <wp:effectExtent b="0" l="0" r="0" t="0"/>
-            <wp:docPr descr="Figure 2" title="" id="27" name="Picture"/>
+            <wp:docPr descr="Figure 3" title="" id="30" name="Picture"/>
             <a:graphic>
               <a:graphicData uri="http://schemas.openxmlformats.org/drawingml/2006/picture">
                 <pic:pic>
                   <pic:nvPicPr>
-                    <pic:cNvPr descr="figures/fig2-importance.png" id="28" name="Picture"/>
+                    <pic:cNvPr descr="figures/fig2-importance.png" id="31" name="Picture"/>
                     <pic:cNvPicPr>
                       <a:picLocks noChangeArrowheads="1" noChangeAspect="1"/>
                     </pic:cNvPicPr>
                   </pic:nvPicPr>
                   <pic:blipFill>
-                    <a:blip r:embed="rId26"/>
+                    <a:blip r:embed="rId29"/>
                     <a:stretch>
                       <a:fillRect/>
                     </a:stretch>
@@ -1538,7 +1657,7 @@
         <w:pStyle w:val="ImageCaption"/>
       </w:pPr>
       <w:r>
-        <w:t xml:space="preserve">Figure 2</w:t>
+        <w:t xml:space="preserve">Figure 3</w:t>
       </w:r>
     </w:p>
     <w:p>
@@ -1550,7 +1669,7 @@
           <w:i/>
           <w:iCs/>
         </w:rPr>
-        <w:t xml:space="preserve">Figure 2. Standardized logistic-regression coefficients. Peak and baseline</w:t>
+        <w:t xml:space="preserve">Figure 3. Standardized logistic-regression coefficients. Peak and baseline</w:t>
       </w:r>
       <w:r>
         <w:rPr>
@@ -1567,8 +1686,8 @@
         <w:t xml:space="preserve">glucose carry the most weight.</w:t>
       </w:r>
     </w:p>
-    <w:bookmarkEnd w:id="29"/>
-    <w:bookmarkStart w:id="30" w:name="Xcc1ee6db3e062a38c7e3603ed8a737c50f2ca01"/>
+    <w:bookmarkEnd w:id="32"/>
+    <w:bookmarkStart w:id="33" w:name="Xcc1ee6db3e062a38c7e3603ed8a737c50f2ca01"/>
     <w:p>
       <w:pPr>
         <w:pStyle w:val="Heading3"/>
@@ -1791,242 +1910,242 @@
         </w:tc>
       </w:tr>
     </w:tbl>
-    <w:bookmarkEnd w:id="30"/>
-    <w:bookmarkEnd w:id="31"/>
-    <w:bookmarkStart w:id="34" w:name="discussion"/>
-    <w:p>
-      <w:pPr>
-        <w:pStyle w:val="Heading2"/>
-      </w:pPr>
-      <w:r>
-        <w:t xml:space="preserve">Discussion</w:t>
-      </w:r>
-    </w:p>
-    <w:p>
-      <w:pPr>
-        <w:pStyle w:val="FirstParagraph"/>
-      </w:pPr>
-      <w:r>
-        <w:t xml:space="preserve">Two findings sit next to each other here. The shape of a meal response holds an</w:t>
-      </w:r>
-      <w:r>
-        <w:t xml:space="preserve"> </w:t>
-      </w:r>
-      <w:r>
-        <w:t xml:space="preserve">individual component that survives adjustment for demographics and fasting labs,</w:t>
-      </w:r>
-      <w:r>
-        <w:t xml:space="preserve"> </w:t>
-      </w:r>
-      <w:r>
-        <w:t xml:space="preserve">and the features that carry that component are the same ones that predict</w:t>
-      </w:r>
-      <w:r>
-        <w:t xml:space="preserve"> </w:t>
-      </w:r>
-      <w:r>
-        <w:t xml:space="preserve">diabetes. The most likely reading is that amplitude features such as peak and</w:t>
-      </w:r>
-      <w:r>
-        <w:t xml:space="preserve"> </w:t>
-      </w:r>
-      <w:r>
-        <w:t xml:space="preserve">baseline glucose reflect slower-moving traits of a person’s metabolism, for</w:t>
-      </w:r>
-      <w:r>
-        <w:t xml:space="preserve"> </w:t>
-      </w:r>
-      <w:r>
-        <w:t xml:space="preserve">instance insulin secretion and clearance, that a one-time demographic and lab</w:t>
-      </w:r>
-      <w:r>
-        <w:t xml:space="preserve"> </w:t>
-      </w:r>
-      <w:r>
-        <w:t xml:space="preserve">panel does not fully capture. Latent factors of that kind, and possibly gastric</w:t>
-      </w:r>
-      <w:r>
-        <w:t xml:space="preserve"> </w:t>
-      </w:r>
-      <w:r>
-        <w:t xml:space="preserve">emptying or gut microbiome, would show up as stable between-person differences in</w:t>
-      </w:r>
-      <w:r>
-        <w:t xml:space="preserve"> </w:t>
-      </w:r>
-      <w:r>
-        <w:t xml:space="preserve">how high glucose climbs and how it settles, which is what the ICC and the</w:t>
-      </w:r>
-      <w:r>
-        <w:t xml:space="preserve"> </w:t>
-      </w:r>
-      <w:r>
-        <w:t xml:space="preserve">fingerprint analyses pick up. For the growing number of people who already wear a</w:t>
-      </w:r>
-      <w:r>
-        <w:t xml:space="preserve"> </w:t>
-      </w:r>
-      <w:r>
-        <w:t xml:space="preserve">sensor, this points toward a passive form of metabolic characterization that</w:t>
-      </w:r>
-      <w:r>
-        <w:t xml:space="preserve"> </w:t>
-      </w:r>
-      <w:r>
-        <w:t xml:space="preserve">needs no extra visit.</w:t>
-      </w:r>
-    </w:p>
-    <w:bookmarkStart w:id="32" w:name="limitations"/>
-    <w:p>
-      <w:pPr>
-        <w:pStyle w:val="Heading3"/>
-      </w:pPr>
-      <w:r>
-        <w:t xml:space="preserve">Limitations</w:t>
-      </w:r>
-    </w:p>
-    <w:p>
-      <w:pPr>
-        <w:pStyle w:val="FirstParagraph"/>
-      </w:pPr>
-      <w:r>
-        <w:t xml:space="preserve">The study is small. Forty-five subjects and a single dataset limit how far the</w:t>
-      </w:r>
-      <w:r>
-        <w:t xml:space="preserve"> </w:t>
-      </w:r>
-      <w:r>
-        <w:t xml:space="preserve">numbers generalize, and the cohort leans toward one population, so the same</w:t>
-      </w:r>
-      <w:r>
-        <w:t xml:space="preserve"> </w:t>
-      </w:r>
-      <w:r>
-        <w:t xml:space="preserve">analysis on a broader group could look different. The most important caveat is</w:t>
-      </w:r>
-      <w:r>
-        <w:t xml:space="preserve"> </w:t>
-      </w:r>
-      <w:r>
-        <w:t xml:space="preserve">the label itself. Diabetes here is defined by fasting glucose and HbA1c, and the</w:t>
-      </w:r>
-      <w:r>
-        <w:t xml:space="preserve"> </w:t>
-      </w:r>
-      <w:r>
-        <w:t xml:space="preserve">two strongest predictors re-measure glucose level, so part of the classification</w:t>
-      </w:r>
-      <w:r>
-        <w:t xml:space="preserve"> </w:t>
-      </w:r>
-      <w:r>
-        <w:t xml:space="preserve">result is expected almost by definition. The ablation above speaks to this: with the</w:t>
-      </w:r>
-      <w:r>
-        <w:t xml:space="preserve"> </w:t>
-      </w:r>
-      <w:r>
-        <w:t xml:space="preserve">amplitude features removed, the shape and kinetic features still predict above</w:t>
-      </w:r>
-      <w:r>
-        <w:t xml:space="preserve"> </w:t>
-      </w:r>
-      <w:r>
-        <w:t xml:space="preserve">chance, so the result is not only a restatement of glucose level. The re-identification accuracy is well above chance but</w:t>
-      </w:r>
-      <w:r>
-        <w:t xml:space="preserve"> </w:t>
-      </w:r>
-      <w:r>
-        <w:t xml:space="preserve">modest, and it moves a little with the random split, so it should be read as</w:t>
-      </w:r>
-      <w:r>
-        <w:t xml:space="preserve"> </w:t>
-      </w:r>
-      <w:r>
-        <w:t xml:space="preserve">evidence of a signature rather than as a working identifier. Finally, the ten</w:t>
-      </w:r>
-      <w:r>
-        <w:t xml:space="preserve"> </w:t>
-      </w:r>
-      <w:r>
-        <w:t xml:space="preserve">features are a compact summary, and meal composition, time of day, and overlap</w:t>
-      </w:r>
-      <w:r>
-        <w:t xml:space="preserve"> </w:t>
-      </w:r>
-      <w:r>
-        <w:t xml:space="preserve">between nearby meals are not modeled, all of which could sharpen or blur the</w:t>
-      </w:r>
-      <w:r>
-        <w:t xml:space="preserve"> </w:t>
-      </w:r>
-      <w:r>
-        <w:t xml:space="preserve">individual signal.</w:t>
-      </w:r>
-    </w:p>
-    <w:bookmarkEnd w:id="32"/>
-    <w:bookmarkStart w:id="33" w:name="conclusion"/>
-    <w:p>
-      <w:pPr>
-        <w:pStyle w:val="Heading3"/>
-      </w:pPr>
-      <w:r>
-        <w:t xml:space="preserve">Conclusion</w:t>
-      </w:r>
-    </w:p>
-    <w:p>
-      <w:pPr>
-        <w:pStyle w:val="FirstParagraph"/>
-      </w:pPr>
-      <w:r>
-        <w:t xml:space="preserve">Postprandial glucose responses carry an individual signature that is not just a</w:t>
-      </w:r>
-      <w:r>
-        <w:t xml:space="preserve"> </w:t>
-      </w:r>
-      <w:r>
-        <w:t xml:space="preserve">restatement of a person’s demographics or labs, and that same signature aligns</w:t>
-      </w:r>
-      <w:r>
-        <w:t xml:space="preserve"> </w:t>
-      </w:r>
-      <w:r>
-        <w:t xml:space="preserve">with their metabolic risk. The effect is small and the cohort is limited, but it</w:t>
-      </w:r>
-      <w:r>
-        <w:t xml:space="preserve"> </w:t>
-      </w:r>
-      <w:r>
-        <w:t xml:space="preserve">is consistent across a repeatability measure, a distance-based test, and a</w:t>
-      </w:r>
-      <w:r>
-        <w:t xml:space="preserve"> </w:t>
-      </w:r>
-      <w:r>
-        <w:t xml:space="preserve">re-identification task, and it survives covariate adjustment. Larger and more</w:t>
-      </w:r>
-      <w:r>
-        <w:t xml:space="preserve"> </w:t>
-      </w:r>
-      <w:r>
-        <w:t xml:space="preserve">diverse data, richer features, and the amplitude-free test noted above would show</w:t>
-      </w:r>
-      <w:r>
-        <w:t xml:space="preserve"> </w:t>
-      </w:r>
-      <w:r>
-        <w:t xml:space="preserve">how much further the idea holds.</w:t>
-      </w:r>
-    </w:p>
     <w:bookmarkEnd w:id="33"/>
     <w:bookmarkEnd w:id="34"/>
-    <w:bookmarkStart w:id="35" w:name="references"/>
+    <w:bookmarkStart w:id="37" w:name="discussion"/>
     <w:p>
       <w:pPr>
         <w:pStyle w:val="Heading2"/>
       </w:pPr>
       <w:r>
+        <w:t xml:space="preserve">Discussion</w:t>
+      </w:r>
+    </w:p>
+    <w:p>
+      <w:pPr>
+        <w:pStyle w:val="FirstParagraph"/>
+      </w:pPr>
+      <w:r>
+        <w:t xml:space="preserve">Two findings sit next to each other here. The shape of a meal response holds an</w:t>
+      </w:r>
+      <w:r>
+        <w:t xml:space="preserve"> </w:t>
+      </w:r>
+      <w:r>
+        <w:t xml:space="preserve">individual component that survives adjustment for demographics and fasting labs,</w:t>
+      </w:r>
+      <w:r>
+        <w:t xml:space="preserve"> </w:t>
+      </w:r>
+      <w:r>
+        <w:t xml:space="preserve">and the features that carry that component are the same ones that predict</w:t>
+      </w:r>
+      <w:r>
+        <w:t xml:space="preserve"> </w:t>
+      </w:r>
+      <w:r>
+        <w:t xml:space="preserve">diabetes. The most likely reading is that amplitude features such as peak and</w:t>
+      </w:r>
+      <w:r>
+        <w:t xml:space="preserve"> </w:t>
+      </w:r>
+      <w:r>
+        <w:t xml:space="preserve">baseline glucose reflect slower-moving traits of a person’s metabolism, for</w:t>
+      </w:r>
+      <w:r>
+        <w:t xml:space="preserve"> </w:t>
+      </w:r>
+      <w:r>
+        <w:t xml:space="preserve">instance insulin secretion and clearance, that a one-time demographic and lab</w:t>
+      </w:r>
+      <w:r>
+        <w:t xml:space="preserve"> </w:t>
+      </w:r>
+      <w:r>
+        <w:t xml:space="preserve">panel does not fully capture. Latent factors of that kind, and possibly gastric</w:t>
+      </w:r>
+      <w:r>
+        <w:t xml:space="preserve"> </w:t>
+      </w:r>
+      <w:r>
+        <w:t xml:space="preserve">emptying or gut microbiome, would show up as stable between-person differences in</w:t>
+      </w:r>
+      <w:r>
+        <w:t xml:space="preserve"> </w:t>
+      </w:r>
+      <w:r>
+        <w:t xml:space="preserve">how high glucose climbs and how it settles, which is what the ICC and the</w:t>
+      </w:r>
+      <w:r>
+        <w:t xml:space="preserve"> </w:t>
+      </w:r>
+      <w:r>
+        <w:t xml:space="preserve">fingerprint analyses pick up. For the growing number of people who already wear a</w:t>
+      </w:r>
+      <w:r>
+        <w:t xml:space="preserve"> </w:t>
+      </w:r>
+      <w:r>
+        <w:t xml:space="preserve">sensor, this points toward a passive form of metabolic characterization that</w:t>
+      </w:r>
+      <w:r>
+        <w:t xml:space="preserve"> </w:t>
+      </w:r>
+      <w:r>
+        <w:t xml:space="preserve">needs no extra visit.</w:t>
+      </w:r>
+    </w:p>
+    <w:bookmarkStart w:id="35" w:name="limitations"/>
+    <w:p>
+      <w:pPr>
+        <w:pStyle w:val="Heading3"/>
+      </w:pPr>
+      <w:r>
+        <w:t xml:space="preserve">Limitations</w:t>
+      </w:r>
+    </w:p>
+    <w:p>
+      <w:pPr>
+        <w:pStyle w:val="FirstParagraph"/>
+      </w:pPr>
+      <w:r>
+        <w:t xml:space="preserve">The study is small. Forty-five subjects and a single dataset limit how far the</w:t>
+      </w:r>
+      <w:r>
+        <w:t xml:space="preserve"> </w:t>
+      </w:r>
+      <w:r>
+        <w:t xml:space="preserve">numbers generalize, and the cohort leans toward one population, so the same</w:t>
+      </w:r>
+      <w:r>
+        <w:t xml:space="preserve"> </w:t>
+      </w:r>
+      <w:r>
+        <w:t xml:space="preserve">analysis on a broader group could look different. The most important caveat is</w:t>
+      </w:r>
+      <w:r>
+        <w:t xml:space="preserve"> </w:t>
+      </w:r>
+      <w:r>
+        <w:t xml:space="preserve">the label itself. Diabetes here is defined by fasting glucose and HbA1c, and the</w:t>
+      </w:r>
+      <w:r>
+        <w:t xml:space="preserve"> </w:t>
+      </w:r>
+      <w:r>
+        <w:t xml:space="preserve">two strongest predictors re-measure glucose level, so part of the classification</w:t>
+      </w:r>
+      <w:r>
+        <w:t xml:space="preserve"> </w:t>
+      </w:r>
+      <w:r>
+        <w:t xml:space="preserve">result is expected almost by definition. The ablation above speaks to this: with the</w:t>
+      </w:r>
+      <w:r>
+        <w:t xml:space="preserve"> </w:t>
+      </w:r>
+      <w:r>
+        <w:t xml:space="preserve">amplitude features removed, the shape and kinetic features still predict above</w:t>
+      </w:r>
+      <w:r>
+        <w:t xml:space="preserve"> </w:t>
+      </w:r>
+      <w:r>
+        <w:t xml:space="preserve">chance, so the result is not only a restatement of glucose level. The re-identification accuracy is well above chance but</w:t>
+      </w:r>
+      <w:r>
+        <w:t xml:space="preserve"> </w:t>
+      </w:r>
+      <w:r>
+        <w:t xml:space="preserve">modest, and it moves a little with the random split, so it should be read as</w:t>
+      </w:r>
+      <w:r>
+        <w:t xml:space="preserve"> </w:t>
+      </w:r>
+      <w:r>
+        <w:t xml:space="preserve">evidence of a signature rather than as a working identifier. Finally, the ten</w:t>
+      </w:r>
+      <w:r>
+        <w:t xml:space="preserve"> </w:t>
+      </w:r>
+      <w:r>
+        <w:t xml:space="preserve">features are a compact summary, and meal composition, time of day, and overlap</w:t>
+      </w:r>
+      <w:r>
+        <w:t xml:space="preserve"> </w:t>
+      </w:r>
+      <w:r>
+        <w:t xml:space="preserve">between nearby meals are not modeled, all of which could sharpen or blur the</w:t>
+      </w:r>
+      <w:r>
+        <w:t xml:space="preserve"> </w:t>
+      </w:r>
+      <w:r>
+        <w:t xml:space="preserve">individual signal.</w:t>
+      </w:r>
+    </w:p>
+    <w:bookmarkEnd w:id="35"/>
+    <w:bookmarkStart w:id="36" w:name="conclusion"/>
+    <w:p>
+      <w:pPr>
+        <w:pStyle w:val="Heading3"/>
+      </w:pPr>
+      <w:r>
+        <w:t xml:space="preserve">Conclusion</w:t>
+      </w:r>
+    </w:p>
+    <w:p>
+      <w:pPr>
+        <w:pStyle w:val="FirstParagraph"/>
+      </w:pPr>
+      <w:r>
+        <w:t xml:space="preserve">Postprandial glucose responses carry an individual signature that is not just a</w:t>
+      </w:r>
+      <w:r>
+        <w:t xml:space="preserve"> </w:t>
+      </w:r>
+      <w:r>
+        <w:t xml:space="preserve">restatement of a person’s demographics or labs, and that same signature aligns</w:t>
+      </w:r>
+      <w:r>
+        <w:t xml:space="preserve"> </w:t>
+      </w:r>
+      <w:r>
+        <w:t xml:space="preserve">with their metabolic risk. The effect is small and the cohort is limited, but it</w:t>
+      </w:r>
+      <w:r>
+        <w:t xml:space="preserve"> </w:t>
+      </w:r>
+      <w:r>
+        <w:t xml:space="preserve">is consistent across a repeatability measure, a distance-based test, and a</w:t>
+      </w:r>
+      <w:r>
+        <w:t xml:space="preserve"> </w:t>
+      </w:r>
+      <w:r>
+        <w:t xml:space="preserve">re-identification task, and it survives covariate adjustment. Larger and more</w:t>
+      </w:r>
+      <w:r>
+        <w:t xml:space="preserve"> </w:t>
+      </w:r>
+      <w:r>
+        <w:t xml:space="preserve">diverse data, richer features, and the amplitude-free test noted above would show</w:t>
+      </w:r>
+      <w:r>
+        <w:t xml:space="preserve"> </w:t>
+      </w:r>
+      <w:r>
+        <w:t xml:space="preserve">how much further the idea holds.</w:t>
+      </w:r>
+    </w:p>
+    <w:bookmarkEnd w:id="36"/>
+    <w:bookmarkEnd w:id="37"/>
+    <w:bookmarkStart w:id="38" w:name="references"/>
+    <w:p>
+      <w:pPr>
+        <w:pStyle w:val="Heading2"/>
+      </w:pPr>
+      <w:r>
         <w:t xml:space="preserve">References</w:t>
       </w:r>
     </w:p>
@@ -2102,8 +2221,8 @@
         <w:t xml:space="preserve">Zeevi, D., Korem, T., Zmora, N., et al. (2015). Personalized nutrition by prediction of glycemic responses. Cell, 163(5), 1079-1094.</w:t>
       </w:r>
     </w:p>
-    <w:bookmarkEnd w:id="35"/>
-    <w:bookmarkEnd w:id="36"/>
+    <w:bookmarkEnd w:id="38"/>
+    <w:bookmarkEnd w:id="39"/>
     <w:sectPr>
       <w:footnotePr>
         <w:numRestart w:val="eachSect"/>

</xml_diff>

<commit_message>
add acknowledgment for project guidance
</commit_message>
<xml_diff>
--- a/manuscript/paper.docx
+++ b/manuscript/paper.docx
@@ -2,7 +2,7 @@
 <file path=word/document.xml><?xml version="1.0" encoding="utf-8"?>
 <w:document xmlns:w="http://schemas.openxmlformats.org/wordprocessingml/2006/main" xmlns:m="http://schemas.openxmlformats.org/officeDocument/2006/math" xmlns:r="http://schemas.openxmlformats.org/officeDocument/2006/relationships" xmlns:o="urn:schemas-microsoft-com:office:office" xmlns:v="urn:schemas-microsoft-com:vml" xmlns:w10="urn:schemas-microsoft-com:office:word" xmlns:a="http://schemas.openxmlformats.org/drawingml/2006/main" xmlns:pic="http://schemas.openxmlformats.org/drawingml/2006/picture" xmlns:wp="http://schemas.openxmlformats.org/drawingml/2006/wordprocessingDrawing">
   <w:body>
-    <w:bookmarkStart w:id="39" w:name="Xd77848edbe84a3c64ad19075b5bd637e09a0ae5"/>
+    <w:bookmarkStart w:id="40" w:name="Xd77848edbe84a3c64ad19075b5bd637e09a0ae5"/>
     <w:p>
       <w:pPr>
         <w:pStyle w:val="Heading1"/>
@@ -2140,12 +2140,30 @@
     </w:p>
     <w:bookmarkEnd w:id="36"/>
     <w:bookmarkEnd w:id="37"/>
-    <w:bookmarkStart w:id="38" w:name="references"/>
+    <w:bookmarkStart w:id="38" w:name="acknowledgments"/>
     <w:p>
       <w:pPr>
         <w:pStyle w:val="Heading2"/>
       </w:pPr>
       <w:r>
+        <w:t xml:space="preserve">Acknowledgments</w:t>
+      </w:r>
+    </w:p>
+    <w:p>
+      <w:pPr>
+        <w:pStyle w:val="FirstParagraph"/>
+      </w:pPr>
+      <w:r>
+        <w:t xml:space="preserve">The author thanks Dr. Seo Ho Song for guidance and feedback throughout this project. This work uses the CGMacros dataset, and the author thanks its creators and PhysioNet for making the data openly available.</w:t>
+      </w:r>
+    </w:p>
+    <w:bookmarkEnd w:id="38"/>
+    <w:bookmarkStart w:id="39" w:name="references"/>
+    <w:p>
+      <w:pPr>
+        <w:pStyle w:val="Heading2"/>
+      </w:pPr>
+      <w:r>
         <w:t xml:space="preserve">References</w:t>
       </w:r>
     </w:p>
@@ -2221,8 +2239,8 @@
         <w:t xml:space="preserve">Zeevi, D., Korem, T., Zmora, N., et al. (2015). Personalized nutrition by prediction of glycemic responses. Cell, 163(5), 1079-1094.</w:t>
       </w:r>
     </w:p>
-    <w:bookmarkEnd w:id="38"/>
     <w:bookmarkEnd w:id="39"/>
+    <w:bookmarkEnd w:id="40"/>
     <w:sectPr>
       <w:footnotePr>
         <w:numRestart w:val="eachSect"/>

</xml_diff>

<commit_message>
use consistent spelling in the manuscript
</commit_message>
<xml_diff>
--- a/manuscript/paper.docx
+++ b/manuscript/paper.docx
@@ -107,7 +107,7 @@
         <w:t xml:space="preserve"> </w:t>
       </w:r>
       <w:r>
-        <w:t xml:space="preserve">nearest-neighbour model re-identifies the subject behind a held-out meal well</w:t>
+        <w:t xml:space="preserve">nearest-neighbor model re-identifies the subject behind a held-out meal well</w:t>
       </w:r>
       <w:r>
         <w:t xml:space="preserve"> </w:t>
@@ -1079,13 +1079,13 @@
         <w:t xml:space="preserve"> </w:t>
       </w:r>
       <w:r>
-        <w:t xml:space="preserve">are split, 80 percent into a gallery and 20 percent held out. A nearest-neighbour</w:t>
-      </w:r>
-      <w:r>
-        <w:t xml:space="preserve"> </w:t>
-      </w:r>
-      <w:r>
-        <w:t xml:space="preserve">model with ten neighbours and a cosine metric is fit on the residualized gallery</w:t>
+        <w:t xml:space="preserve">are split, 80 percent into a gallery and 20 percent held out. A nearest-neighbor</w:t>
+      </w:r>
+      <w:r>
+        <w:t xml:space="preserve"> </w:t>
+      </w:r>
+      <w:r>
+        <w:t xml:space="preserve">model with ten neighbors and a cosine metric is fit on the residualized gallery</w:t>
       </w:r>
       <w:r>
         <w:t xml:space="preserve"> </w:t>
@@ -1133,7 +1133,7 @@
         <w:pStyle w:val="FirstParagraph"/>
       </w:pPr>
       <w:r>
-        <w:t xml:space="preserve">Finally we test whether the same features predict diabetes. Subjects are labelled</w:t>
+        <w:t xml:space="preserve">Finally we test whether the same features predict diabetes. Subjects are labeled</w:t>
       </w:r>
       <w:r>
         <w:t xml:space="preserve"> </w:t>
@@ -1512,7 +1512,7 @@
         <w:t xml:space="preserve"> </w:t>
       </w:r>
       <w:r>
-        <w:t xml:space="preserve">held-out meal, the nearest-neighbour model names the correct person first about</w:t>
+        <w:t xml:space="preserve">held-out meal, the nearest-neighbor model names the correct person first about</w:t>
       </w:r>
       <w:r>
         <w:t xml:space="preserve"> </w:t>

</xml_diff>

<commit_message>
expand the code note into a reproducibility statement and pin the release
</commit_message>
<xml_diff>
--- a/manuscript/paper.docx
+++ b/manuscript/paper.docx
@@ -2,7 +2,7 @@
 <file path=word/document.xml><?xml version="1.0" encoding="utf-8"?>
 <w:document xmlns:w="http://schemas.openxmlformats.org/wordprocessingml/2006/main" xmlns:m="http://schemas.openxmlformats.org/officeDocument/2006/math" xmlns:r="http://schemas.openxmlformats.org/officeDocument/2006/relationships" xmlns:o="urn:schemas-microsoft-com:office:office" xmlns:v="urn:schemas-microsoft-com:vml" xmlns:w10="urn:schemas-microsoft-com:office:word" xmlns:a="http://schemas.openxmlformats.org/drawingml/2006/main" xmlns:pic="http://schemas.openxmlformats.org/drawingml/2006/picture" xmlns:wp="http://schemas.openxmlformats.org/drawingml/2006/wordprocessingDrawing">
   <w:body>
-    <w:bookmarkStart w:id="40" w:name="Xd77848edbe84a3c64ad19075b5bd637e09a0ae5"/>
+    <w:bookmarkStart w:id="41" w:name="Xd77848edbe84a3c64ad19075b5bd637e09a0ae5"/>
     <w:p>
       <w:pPr>
         <w:pStyle w:val="Heading1"/>
@@ -2140,12 +2140,30 @@
     </w:p>
     <w:bookmarkEnd w:id="36"/>
     <w:bookmarkEnd w:id="37"/>
-    <w:bookmarkStart w:id="38" w:name="acknowledgments"/>
+    <w:bookmarkStart w:id="38" w:name="reproducibility"/>
     <w:p>
       <w:pPr>
         <w:pStyle w:val="Heading2"/>
       </w:pPr>
       <w:r>
+        <w:t xml:space="preserve">Reproducibility</w:t>
+      </w:r>
+    </w:p>
+    <w:p>
+      <w:pPr>
+        <w:pStyle w:val="FirstParagraph"/>
+      </w:pPr>
+      <w:r>
+        <w:t xml:space="preserve">The CGMacros dataset is publicly available from PhysioNet. All feature-extraction and analysis code is open source at github.com/sunjungco2027-hub/cgm-individuality, and a single command regenerates every number reported here. The pipeline is deterministic: random splits are seeded and the re-identification result is averaged over twenty fixed splits. A test suite pins the reported values so that any change moving them is caught, and a separate set of tests checks the intraclass correlation against an independent one-way ANOVA computation and verifies the effect-size and permutation calculations on synthetic data with known answers. The results in this paper correspond to the tagged release v1.0 of the repository.</w:t>
+      </w:r>
+    </w:p>
+    <w:bookmarkEnd w:id="38"/>
+    <w:bookmarkStart w:id="39" w:name="acknowledgments"/>
+    <w:p>
+      <w:pPr>
+        <w:pStyle w:val="Heading2"/>
+      </w:pPr>
+      <w:r>
         <w:t xml:space="preserve">Acknowledgments</w:t>
       </w:r>
     </w:p>
@@ -2157,8 +2175,8 @@
         <w:t xml:space="preserve">The author thanks Dr. Seo Ho Song for guidance and feedback throughout this project. This work uses the CGMacros dataset, and the author thanks its creators and PhysioNet for making the data openly available.</w:t>
       </w:r>
     </w:p>
-    <w:bookmarkEnd w:id="38"/>
-    <w:bookmarkStart w:id="39" w:name="references"/>
+    <w:bookmarkEnd w:id="39"/>
+    <w:bookmarkStart w:id="40" w:name="references"/>
     <w:p>
       <w:pPr>
         <w:pStyle w:val="Heading2"/>
@@ -2239,8 +2257,8 @@
         <w:t xml:space="preserve">Zeevi, D., Korem, T., Zmora, N., et al. (2015). Personalized nutrition by prediction of glycemic responses. Cell, 163(5), 1079-1094.</w:t>
       </w:r>
     </w:p>
-    <w:bookmarkEnd w:id="39"/>
     <w:bookmarkEnd w:id="40"/>
+    <w:bookmarkEnd w:id="41"/>
     <w:sectPr>
       <w:footnotePr>
         <w:numRestart w:val="eachSect"/>

</xml_diff>

<commit_message>
make the repository link clickable in the pdf and docx
</commit_message>
<xml_diff>
--- a/manuscript/paper.docx
+++ b/manuscript/paper.docx
@@ -2,7 +2,7 @@
 <file path=word/document.xml><?xml version="1.0" encoding="utf-8"?>
 <w:document xmlns:w="http://schemas.openxmlformats.org/wordprocessingml/2006/main" xmlns:m="http://schemas.openxmlformats.org/officeDocument/2006/math" xmlns:r="http://schemas.openxmlformats.org/officeDocument/2006/relationships" xmlns:o="urn:schemas-microsoft-com:office:office" xmlns:v="urn:schemas-microsoft-com:vml" xmlns:w10="urn:schemas-microsoft-com:office:word" xmlns:a="http://schemas.openxmlformats.org/drawingml/2006/main" xmlns:pic="http://schemas.openxmlformats.org/drawingml/2006/picture" xmlns:wp="http://schemas.openxmlformats.org/drawingml/2006/wordprocessingDrawing">
   <w:body>
-    <w:bookmarkStart w:id="41" w:name="Xd77848edbe84a3c64ad19075b5bd637e09a0ae5"/>
+    <w:bookmarkStart w:id="42" w:name="Xd77848edbe84a3c64ad19075b5bd637e09a0ae5"/>
     <w:p>
       <w:pPr>
         <w:pStyle w:val="Heading1"/>
@@ -2140,7 +2140,7 @@
     </w:p>
     <w:bookmarkEnd w:id="36"/>
     <w:bookmarkEnd w:id="37"/>
-    <w:bookmarkStart w:id="38" w:name="reproducibility"/>
+    <w:bookmarkStart w:id="39" w:name="reproducibility"/>
     <w:p>
       <w:pPr>
         <w:pStyle w:val="Heading2"/>
@@ -2154,11 +2154,25 @@
         <w:pStyle w:val="FirstParagraph"/>
       </w:pPr>
       <w:r>
-        <w:t xml:space="preserve">The CGMacros dataset is publicly available from PhysioNet. All feature-extraction and analysis code is open source at github.com/sunjungco2027-hub/cgm-individuality, and a single command regenerates every number reported here. The pipeline is deterministic: random splits are seeded and the re-identification result is averaged over twenty fixed splits. A test suite pins the reported values so that any change moving them is caught, and a separate set of tests checks the intraclass correlation against an independent one-way ANOVA computation and verifies the effect-size and permutation calculations on synthetic data with known answers. The results in this paper correspond to the tagged release v1.0 of the repository.</w:t>
-      </w:r>
-    </w:p>
-    <w:bookmarkEnd w:id="38"/>
-    <w:bookmarkStart w:id="39" w:name="acknowledgments"/>
+        <w:t xml:space="preserve">The CGMacros dataset is publicly available from PhysioNet. All feature-extraction and analysis code is open source at</w:t>
+      </w:r>
+      <w:r>
+        <w:t xml:space="preserve"> </w:t>
+      </w:r>
+      <w:hyperlink r:id="rId38">
+        <w:r>
+          <w:rPr>
+            <w:rStyle w:val="Hyperlink"/>
+          </w:rPr>
+          <w:t xml:space="preserve">github.com/sunjungco2027-hub/cgm-individuality</w:t>
+        </w:r>
+      </w:hyperlink>
+      <w:r>
+        <w:t xml:space="preserve">, and a single command regenerates every number reported here. The pipeline is deterministic: random splits are seeded and the re-identification result is averaged over twenty fixed splits. A test suite pins the reported values so that any change moving them is caught, and a separate set of tests checks the intraclass correlation against an independent one-way ANOVA computation and verifies the effect-size and permutation calculations on synthetic data with known answers. The results in this paper correspond to the tagged release v1.0 of the repository.</w:t>
+      </w:r>
+    </w:p>
+    <w:bookmarkEnd w:id="39"/>
+    <w:bookmarkStart w:id="40" w:name="acknowledgments"/>
     <w:p>
       <w:pPr>
         <w:pStyle w:val="Heading2"/>
@@ -2175,8 +2189,8 @@
         <w:t xml:space="preserve">The author thanks Dr. Seo Ho Song for guidance and feedback throughout this project. This work uses the CGMacros dataset, and the author thanks its creators and PhysioNet for making the data openly available.</w:t>
       </w:r>
     </w:p>
-    <w:bookmarkEnd w:id="39"/>
-    <w:bookmarkStart w:id="40" w:name="references"/>
+    <w:bookmarkEnd w:id="40"/>
+    <w:bookmarkStart w:id="41" w:name="references"/>
     <w:p>
       <w:pPr>
         <w:pStyle w:val="Heading2"/>
@@ -2257,8 +2271,8 @@
         <w:t xml:space="preserve">Zeevi, D., Korem, T., Zmora, N., et al. (2015). Personalized nutrition by prediction of glycemic responses. Cell, 163(5), 1079-1094.</w:t>
       </w:r>
     </w:p>
-    <w:bookmarkEnd w:id="40"/>
     <w:bookmarkEnd w:id="41"/>
+    <w:bookmarkEnd w:id="42"/>
     <w:sectPr>
       <w:footnotePr>
         <w:numRestart w:val="eachSect"/>

</xml_diff>